<commit_message>
Updated backend and database functionality
</commit_message>
<xml_diff>
--- a/backend/outputs/TABLE OF CONTENTS (1)_reconstructed_hi.docx
+++ b/backend/outputs/TABLE OF CONTENTS (1)_reconstructed_hi.docx
@@ -5,32 +5,45 @@
     <w:p>
       <w:pPr>
         <w:pStyle w:val="BodyText"/>
+        <w:jc w:val="center"/>
       </w:pPr>
       <w:r>
         <w:rPr>
-          <w:spacing w:val="-2"/>
+          <w:rFonts w:cs="Nirmala UI" w:eastAsia="Nirmala UI"/>
+          <w:b/>
+          <w:bCs/>
         </w:rPr>
-        <w:t>संदेशों की तालिका।</w:t>
+        <w:t>गोली</w:t>
       </w:r>
       <w:r>
         <w:rPr>
-          <w:spacing w:val="-14"/>
+          <w:b/>
+          <w:bCs/>
         </w:rPr>
+        <w:t xml:space="preserve"> </w:t>
       </w:r>
       <w:r>
         <w:rPr>
-          <w:spacing w:val="-2"/>
+          <w:rFonts w:cs="Nirmala UI" w:eastAsia="Nirmala UI"/>
+          <w:b/>
+          <w:bCs/>
         </w:rPr>
+        <w:t>का</w:t>
       </w:r>
       <w:r>
         <w:rPr>
-          <w:spacing w:val="-23"/>
+          <w:b/>
+          <w:bCs/>
         </w:rPr>
+        <w:t xml:space="preserve"> </w:t>
       </w:r>
       <w:r>
         <w:rPr>
-          <w:spacing w:val="-2"/>
+          <w:rFonts w:cs="Nirmala UI" w:eastAsia="Nirmala UI"/>
+          <w:b/>
+          <w:bCs/>
         </w:rPr>
+        <w:t>टिप्पणियां</w:t>
       </w:r>
     </w:p>
     <w:tbl>
@@ -72,6 +85,7 @@
             <w:pPr>
               <w:pStyle w:val="TableParagraph"/>
               <w:spacing w:before="172"/>
+              <w:jc w:val="left"/>
               <w:rPr>
                 <w:b/>
                 <w:sz w:val="28"/>
@@ -82,24 +96,31 @@
             <w:pPr>
               <w:pStyle w:val="TableParagraph"/>
               <w:ind w:left="280"/>
-              <w:rPr>
-                <w:b/>
-                <w:sz w:val="28"/>
-              </w:rPr>
-            </w:pPr>
-            <w:r>
-              <w:rPr>
-                <w:b/>
-                <w:sz w:val="28"/>
-              </w:rPr>
-              <w:t>एस. . नहीं ।</w:t>
-            </w:r>
-            <w:r>
-              <w:rPr>
-                <w:b/>
-                <w:spacing w:val="-5"/>
-                <w:sz w:val="28"/>
-              </w:rPr>
+              <w:jc w:val="left"/>
+              <w:rPr>
+                <w:b/>
+                <w:sz w:val="28"/>
+              </w:rPr>
+            </w:pPr>
+            <w:r>
+              <w:rPr>
+                <w:rFonts w:cs="Nirmala UI" w:eastAsia="Nirmala UI"/>
+                <w:b/>
+                <w:bCs/>
+                <w:sz w:val="28"/>
+                <w:szCs w:val="28"/>
+              </w:rPr>
+              <w:t xml:space="preserve">एस. </w:t>
+            </w:r>
+            <w:r>
+              <w:rPr>
+                <w:rFonts w:cs="Nirmala UI" w:eastAsia="Nirmala UI"/>
+                <w:b/>
+                <w:bCs/>
+                <w:sz w:val="28"/>
+                <w:szCs w:val="28"/>
+              </w:rPr>
+              <w:t>नहीं.</w:t>
             </w:r>
           </w:p>
         </w:tc>
@@ -111,6 +132,7 @@
             <w:pPr>
               <w:pStyle w:val="TableParagraph"/>
               <w:spacing w:before="172"/>
+              <w:jc w:val="left"/>
               <w:rPr>
                 <w:b/>
                 <w:sz w:val="28"/>
@@ -129,9 +151,11 @@
             </w:pPr>
             <w:r>
               <w:rPr>
-                <w:b/>
-                <w:spacing w:val="-2"/>
-                <w:sz w:val="28"/>
+                <w:rFonts w:cs="Nirmala UI" w:eastAsia="Nirmala UI"/>
+                <w:b/>
+                <w:bCs/>
+                <w:sz w:val="28"/>
+                <w:szCs w:val="28"/>
               </w:rPr>
               <w:t>सहमति</w:t>
             </w:r>
@@ -145,6 +169,7 @@
             <w:pPr>
               <w:pStyle w:val="TableParagraph"/>
               <w:spacing w:before="172"/>
+              <w:jc w:val="left"/>
               <w:rPr>
                 <w:b/>
                 <w:sz w:val="28"/>
@@ -163,24 +188,32 @@
             </w:pPr>
             <w:r>
               <w:rPr>
-                <w:b/>
-                <w:sz w:val="28"/>
-              </w:rPr>
-              <w:t>पृष्ठ नं.</w:t>
-            </w:r>
-            <w:r>
-              <w:rPr>
-                <w:b/>
-                <w:spacing w:val="-2"/>
-                <w:sz w:val="28"/>
-              </w:rPr>
-            </w:r>
-            <w:r>
-              <w:rPr>
-                <w:b/>
-                <w:spacing w:val="-5"/>
-                <w:sz w:val="28"/>
-              </w:rPr>
+                <w:rFonts w:cs="Nirmala UI" w:eastAsia="Nirmala UI"/>
+                <w:b/>
+                <w:bCs/>
+                <w:sz w:val="28"/>
+                <w:szCs w:val="28"/>
+              </w:rPr>
+              <w:t>पृष्ठ</w:t>
+            </w:r>
+            <w:r>
+              <w:rPr>
+                <w:b/>
+                <w:bCs/>
+                <w:sz w:val="28"/>
+                <w:szCs w:val="28"/>
+              </w:rPr>
+              <w:t xml:space="preserve"> </w:t>
+            </w:r>
+            <w:r>
+              <w:rPr>
+                <w:rFonts w:cs="Nirmala UI" w:eastAsia="Nirmala UI"/>
+                <w:b/>
+                <w:bCs/>
+                <w:sz w:val="28"/>
+                <w:szCs w:val="28"/>
+              </w:rPr>
+              <w:t>नहीं.</w:t>
             </w:r>
           </w:p>
         </w:tc>
@@ -197,6 +230,7 @@
             <w:pPr>
               <w:pStyle w:val="TableParagraph"/>
               <w:spacing w:before="171"/>
+              <w:jc w:val="left"/>
               <w:rPr>
                 <w:b/>
                 <w:sz w:val="28"/>
@@ -214,10 +248,11 @@
             </w:pPr>
             <w:r>
               <w:rPr>
-                <w:spacing w:val="-10"/>
-                <w:sz w:val="28"/>
-              </w:rPr>
-              <w:t>मैं।</w:t>
+                <w:rFonts w:cs="Nirmala UI" w:eastAsia="Nirmala UI"/>
+                <w:sz w:val="28"/>
+                <w:szCs w:val="28"/>
+              </w:rPr>
+              <w:t>मैं</w:t>
             </w:r>
           </w:p>
         </w:tc>
@@ -229,6 +264,7 @@
             <w:pPr>
               <w:pStyle w:val="TableParagraph"/>
               <w:spacing w:before="171"/>
+              <w:jc w:val="left"/>
               <w:rPr>
                 <w:b/>
                 <w:sz w:val="28"/>
@@ -246,8 +282,9 @@
             </w:pPr>
             <w:r>
               <w:rPr>
-                <w:spacing w:val="-2"/>
-                <w:sz w:val="28"/>
+                <w:rFonts w:cs="Nirmala UI" w:eastAsia="Nirmala UI"/>
+                <w:sz w:val="28"/>
+                <w:szCs w:val="28"/>
               </w:rPr>
               <w:t>प्रमाणपत्र</w:t>
             </w:r>
@@ -261,6 +298,7 @@
             <w:pPr>
               <w:pStyle w:val="TableParagraph"/>
               <w:spacing w:before="171"/>
+              <w:jc w:val="left"/>
               <w:rPr>
                 <w:b/>
                 <w:sz w:val="28"/>
@@ -278,10 +316,11 @@
             </w:pPr>
             <w:r>
               <w:rPr>
-                <w:spacing w:val="-10"/>
-                <w:sz w:val="28"/>
-              </w:rPr>
-              <w:t>मैं।</w:t>
+                <w:rFonts w:cs="Nirmala UI" w:eastAsia="Nirmala UI"/>
+                <w:sz w:val="28"/>
+                <w:szCs w:val="28"/>
+              </w:rPr>
+              <w:t>मैं</w:t>
             </w:r>
           </w:p>
         </w:tc>
@@ -298,6 +337,7 @@
             <w:pPr>
               <w:pStyle w:val="TableParagraph"/>
               <w:spacing w:before="167"/>
+              <w:jc w:val="left"/>
               <w:rPr>
                 <w:b/>
                 <w:sz w:val="28"/>
@@ -315,8 +355,8 @@
             </w:pPr>
             <w:r>
               <w:rPr>
-                <w:spacing w:val="-5"/>
-                <w:sz w:val="28"/>
+                <w:sz w:val="28"/>
+                <w:szCs w:val="28"/>
               </w:rPr>
               <w:t>ii.</w:t>
             </w:r>
@@ -330,6 +370,7 @@
             <w:pPr>
               <w:pStyle w:val="TableParagraph"/>
               <w:spacing w:before="167"/>
+              <w:jc w:val="left"/>
               <w:rPr>
                 <w:b/>
                 <w:sz w:val="28"/>
@@ -347,8 +388,9 @@
             </w:pPr>
             <w:r>
               <w:rPr>
-                <w:spacing w:val="-2"/>
-                <w:sz w:val="28"/>
+                <w:rFonts w:cs="Nirmala UI" w:eastAsia="Nirmala UI"/>
+                <w:sz w:val="28"/>
+                <w:szCs w:val="28"/>
               </w:rPr>
               <w:t>घोषणा</w:t>
             </w:r>
@@ -362,6 +404,7 @@
             <w:pPr>
               <w:pStyle w:val="TableParagraph"/>
               <w:spacing w:before="167"/>
+              <w:jc w:val="left"/>
               <w:rPr>
                 <w:b/>
                 <w:sz w:val="28"/>
@@ -379,8 +422,8 @@
             </w:pPr>
             <w:r>
               <w:rPr>
-                <w:spacing w:val="-5"/>
-                <w:sz w:val="28"/>
+                <w:sz w:val="28"/>
+                <w:szCs w:val="28"/>
               </w:rPr>
               <w:t>ii.</w:t>
             </w:r>
@@ -399,6 +442,7 @@
             <w:pPr>
               <w:pStyle w:val="TableParagraph"/>
               <w:spacing w:before="246"/>
+              <w:jc w:val="left"/>
               <w:rPr>
                 <w:b/>
                 <w:sz w:val="28"/>
@@ -416,8 +460,8 @@
             </w:pPr>
             <w:r>
               <w:rPr>
-                <w:spacing w:val="-5"/>
-                <w:sz w:val="28"/>
+                <w:sz w:val="28"/>
+                <w:szCs w:val="28"/>
               </w:rPr>
               <w:t>iii.</w:t>
             </w:r>
@@ -431,6 +475,7 @@
             <w:pPr>
               <w:pStyle w:val="TableParagraph"/>
               <w:spacing w:before="246"/>
+              <w:jc w:val="left"/>
               <w:rPr>
                 <w:b/>
                 <w:sz w:val="28"/>
@@ -448,10 +493,11 @@
             </w:pPr>
             <w:r>
               <w:rPr>
-                <w:spacing w:val="-2"/>
-                <w:sz w:val="28"/>
-              </w:rPr>
-              <w:t>स्वीकार करते हैं।</w:t>
+                <w:rFonts w:cs="Nirmala UI" w:eastAsia="Nirmala UI"/>
+                <w:sz w:val="28"/>
+                <w:szCs w:val="28"/>
+              </w:rPr>
+              <w:t>स्वीकार करते हैं</w:t>
             </w:r>
           </w:p>
         </w:tc>
@@ -463,6 +509,7 @@
             <w:pPr>
               <w:pStyle w:val="TableParagraph"/>
               <w:spacing w:before="246"/>
+              <w:jc w:val="left"/>
               <w:rPr>
                 <w:b/>
                 <w:sz w:val="28"/>
@@ -480,8 +527,8 @@
             </w:pPr>
             <w:r>
               <w:rPr>
-                <w:spacing w:val="-5"/>
-                <w:sz w:val="28"/>
+                <w:sz w:val="28"/>
+                <w:szCs w:val="28"/>
               </w:rPr>
               <w:t>iii.</w:t>
             </w:r>
@@ -500,6 +547,7 @@
             <w:pPr>
               <w:pStyle w:val="TableParagraph"/>
               <w:spacing w:before="172"/>
+              <w:jc w:val="left"/>
               <w:rPr>
                 <w:b/>
                 <w:sz w:val="28"/>
@@ -517,8 +565,8 @@
             </w:pPr>
             <w:r>
               <w:rPr>
-                <w:spacing w:val="-10"/>
-                <w:sz w:val="28"/>
+                <w:sz w:val="28"/>
+                <w:szCs w:val="28"/>
               </w:rPr>
               <w:t>1</w:t>
             </w:r>
@@ -532,6 +580,7 @@
             <w:pPr>
               <w:pStyle w:val="TableParagraph"/>
               <w:spacing w:before="172"/>
+              <w:jc w:val="left"/>
               <w:rPr>
                 <w:b/>
                 <w:sz w:val="28"/>
@@ -549,10 +598,11 @@
             </w:pPr>
             <w:r>
               <w:rPr>
-                <w:spacing w:val="-2"/>
-                <w:sz w:val="28"/>
-              </w:rPr>
-              <w:t>परिचय ।</w:t>
+                <w:rFonts w:cs="Nirmala UI" w:eastAsia="Nirmala UI"/>
+                <w:sz w:val="28"/>
+                <w:szCs w:val="28"/>
+              </w:rPr>
+              <w:t>परिचय</w:t>
             </w:r>
           </w:p>
         </w:tc>
@@ -564,6 +614,7 @@
             <w:pPr>
               <w:pStyle w:val="TableParagraph"/>
               <w:spacing w:before="172"/>
+              <w:jc w:val="left"/>
               <w:rPr>
                 <w:b/>
                 <w:sz w:val="28"/>
@@ -582,14 +633,16 @@
             <w:r>
               <w:rPr>
                 <w:sz w:val="28"/>
-              </w:rPr>
-              <w:t>1-3 की बराबरी की।</w:t>
-            </w:r>
-            <w:r>
-              <w:rPr>
-                <w:spacing w:val="-5"/>
-                <w:sz w:val="28"/>
-              </w:rPr>
+                <w:szCs w:val="28"/>
+              </w:rPr>
+              <w:t>1-</w:t>
+            </w:r>
+            <w:r>
+              <w:rPr>
+                <w:sz w:val="28"/>
+                <w:szCs w:val="28"/>
+              </w:rPr>
+              <w:t>13</w:t>
             </w:r>
           </w:p>
         </w:tc>
@@ -606,6 +659,7 @@
             <w:pPr>
               <w:pStyle w:val="TableParagraph"/>
               <w:spacing w:before="171"/>
+              <w:jc w:val="left"/>
               <w:rPr>
                 <w:b/>
                 <w:sz w:val="28"/>
@@ -623,8 +677,8 @@
             </w:pPr>
             <w:r>
               <w:rPr>
-                <w:spacing w:val="-10"/>
-                <w:sz w:val="28"/>
+                <w:sz w:val="28"/>
+                <w:szCs w:val="28"/>
               </w:rPr>
               <w:t>2</w:t>
             </w:r>
@@ -638,6 +692,7 @@
             <w:pPr>
               <w:pStyle w:val="TableParagraph"/>
               <w:spacing w:before="171"/>
+              <w:jc w:val="left"/>
               <w:rPr>
                 <w:b/>
                 <w:sz w:val="28"/>
@@ -655,32 +710,41 @@
             </w:pPr>
             <w:r>
               <w:rPr>
-                <w:sz w:val="28"/>
-              </w:rPr>
-              <w:t>साहित्य की समीक्षा।</w:t>
-            </w:r>
-            <w:r>
-              <w:rPr>
-                <w:spacing w:val="-3"/>
-                <w:sz w:val="28"/>
-              </w:rPr>
-            </w:r>
-            <w:r>
-              <w:rPr>
-                <w:sz w:val="28"/>
-              </w:rPr>
-            </w:r>
-            <w:r>
-              <w:rPr>
-                <w:spacing w:val="1"/>
-                <w:sz w:val="28"/>
-              </w:rPr>
-            </w:r>
-            <w:r>
-              <w:rPr>
-                <w:spacing w:val="-2"/>
-                <w:sz w:val="28"/>
-              </w:rPr>
+                <w:rFonts w:cs="Nirmala UI" w:eastAsia="Nirmala UI"/>
+                <w:sz w:val="28"/>
+                <w:szCs w:val="28"/>
+              </w:rPr>
+              <w:t>समीक्षा करें</w:t>
+            </w:r>
+            <w:r>
+              <w:rPr>
+                <w:sz w:val="28"/>
+                <w:szCs w:val="28"/>
+              </w:rPr>
+              <w:t xml:space="preserve"> </w:t>
+            </w:r>
+            <w:r>
+              <w:rPr>
+                <w:rFonts w:cs="Nirmala UI" w:eastAsia="Nirmala UI"/>
+                <w:sz w:val="28"/>
+                <w:szCs w:val="28"/>
+              </w:rPr>
+              <w:t>का</w:t>
+            </w:r>
+            <w:r>
+              <w:rPr>
+                <w:sz w:val="28"/>
+                <w:szCs w:val="28"/>
+              </w:rPr>
+              <w:t xml:space="preserve"> </w:t>
+            </w:r>
+            <w:r>
+              <w:rPr>
+                <w:rFonts w:cs="Nirmala UI" w:eastAsia="Nirmala UI"/>
+                <w:sz w:val="28"/>
+                <w:szCs w:val="28"/>
+              </w:rPr>
+              <w:t>साहित्य</w:t>
             </w:r>
           </w:p>
         </w:tc>
@@ -692,6 +756,7 @@
             <w:pPr>
               <w:pStyle w:val="TableParagraph"/>
               <w:spacing w:before="171"/>
+              <w:jc w:val="left"/>
               <w:rPr>
                 <w:b/>
                 <w:sz w:val="28"/>
@@ -710,14 +775,16 @@
             <w:r>
               <w:rPr>
                 <w:sz w:val="28"/>
-              </w:rPr>
-              <w:t>14-24।</w:t>
-            </w:r>
-            <w:r>
-              <w:rPr>
-                <w:spacing w:val="-5"/>
-                <w:sz w:val="28"/>
-              </w:rPr>
+                <w:szCs w:val="28"/>
+              </w:rPr>
+              <w:t>14-</w:t>
+            </w:r>
+            <w:r>
+              <w:rPr>
+                <w:sz w:val="28"/>
+                <w:szCs w:val="28"/>
+              </w:rPr>
+              <w:t>24</w:t>
             </w:r>
           </w:p>
         </w:tc>
@@ -734,6 +801,7 @@
             <w:pPr>
               <w:pStyle w:val="TableParagraph"/>
               <w:spacing w:before="171"/>
+              <w:jc w:val="left"/>
               <w:rPr>
                 <w:b/>
                 <w:sz w:val="28"/>
@@ -751,8 +819,8 @@
             </w:pPr>
             <w:r>
               <w:rPr>
-                <w:spacing w:val="-10"/>
-                <w:sz w:val="28"/>
+                <w:sz w:val="28"/>
+                <w:szCs w:val="28"/>
               </w:rPr>
               <w:t>3</w:t>
             </w:r>
@@ -766,6 +834,7 @@
             <w:pPr>
               <w:pStyle w:val="TableParagraph"/>
               <w:spacing w:before="171"/>
+              <w:jc w:val="left"/>
               <w:rPr>
                 <w:b/>
                 <w:sz w:val="28"/>
@@ -783,16 +852,19 @@
             </w:pPr>
             <w:r>
               <w:rPr>
-                <w:sz w:val="28"/>
-              </w:rPr>
-              <w:br/>
-              <w:t>Research Methodology</w:t>
-            </w:r>
-            <w:r>
-              <w:rPr>
-                <w:spacing w:val="-2"/>
-                <w:sz w:val="28"/>
-              </w:rPr>
+                <w:rFonts w:cs="Nirmala UI" w:eastAsia="Nirmala UI"/>
+                <w:sz w:val="28"/>
+                <w:szCs w:val="28"/>
+              </w:rPr>
+              <w:t xml:space="preserve">अनुसंधान </w:t>
+            </w:r>
+            <w:r>
+              <w:rPr>
+                <w:rFonts w:cs="Nirmala UI" w:eastAsia="Nirmala UI"/>
+                <w:sz w:val="28"/>
+                <w:szCs w:val="28"/>
+              </w:rPr>
+              <w:t>विधिशास्त्र</w:t>
             </w:r>
           </w:p>
         </w:tc>
@@ -804,6 +876,7 @@
             <w:pPr>
               <w:pStyle w:val="TableParagraph"/>
               <w:spacing w:before="171"/>
+              <w:jc w:val="left"/>
               <w:rPr>
                 <w:b/>
                 <w:sz w:val="28"/>
@@ -822,14 +895,16 @@
             <w:r>
               <w:rPr>
                 <w:sz w:val="28"/>
-              </w:rPr>
-              <w:t>25-27 ।</w:t>
-            </w:r>
-            <w:r>
-              <w:rPr>
-                <w:spacing w:val="-5"/>
-                <w:sz w:val="28"/>
-              </w:rPr>
+                <w:szCs w:val="28"/>
+              </w:rPr>
+              <w:t>25-</w:t>
+            </w:r>
+            <w:r>
+              <w:rPr>
+                <w:sz w:val="28"/>
+                <w:szCs w:val="28"/>
+              </w:rPr>
+              <w:t>27</w:t>
             </w:r>
           </w:p>
         </w:tc>
@@ -846,6 +921,7 @@
             <w:pPr>
               <w:pStyle w:val="TableParagraph"/>
               <w:spacing w:before="167"/>
+              <w:jc w:val="left"/>
               <w:rPr>
                 <w:b/>
                 <w:sz w:val="28"/>
@@ -863,8 +939,8 @@
             </w:pPr>
             <w:r>
               <w:rPr>
-                <w:spacing w:val="-10"/>
-                <w:sz w:val="28"/>
+                <w:sz w:val="28"/>
+                <w:szCs w:val="28"/>
               </w:rPr>
               <w:t>4</w:t>
             </w:r>
@@ -878,6 +954,7 @@
             <w:pPr>
               <w:pStyle w:val="TableParagraph"/>
               <w:spacing w:before="167"/>
+              <w:jc w:val="left"/>
               <w:rPr>
                 <w:b/>
                 <w:sz w:val="28"/>
@@ -895,32 +972,41 @@
             </w:pPr>
             <w:r>
               <w:rPr>
-                <w:sz w:val="28"/>
-              </w:rPr>
-              <w:t>अध्ययन का उद्देश्य।</w:t>
-            </w:r>
-            <w:r>
-              <w:rPr>
-                <w:spacing w:val="1"/>
-                <w:sz w:val="28"/>
-              </w:rPr>
-            </w:r>
-            <w:r>
-              <w:rPr>
-                <w:sz w:val="28"/>
-              </w:rPr>
-            </w:r>
-            <w:r>
-              <w:rPr>
-                <w:spacing w:val="1"/>
-                <w:sz w:val="28"/>
-              </w:rPr>
-            </w:r>
-            <w:r>
-              <w:rPr>
-                <w:spacing w:val="-4"/>
-                <w:sz w:val="28"/>
-              </w:rPr>
+                <w:rFonts w:cs="Nirmala UI" w:eastAsia="Nirmala UI"/>
+                <w:sz w:val="28"/>
+                <w:szCs w:val="28"/>
+              </w:rPr>
+              <w:t>इसका उद्देश्य.</w:t>
+            </w:r>
+            <w:r>
+              <w:rPr>
+                <w:sz w:val="28"/>
+                <w:szCs w:val="28"/>
+              </w:rPr>
+              <w:t xml:space="preserve"> </w:t>
+            </w:r>
+            <w:r>
+              <w:rPr>
+                <w:rFonts w:cs="Nirmala UI" w:eastAsia="Nirmala UI"/>
+                <w:sz w:val="28"/>
+                <w:szCs w:val="28"/>
+              </w:rPr>
+              <w:t>द</w:t>
+            </w:r>
+            <w:r>
+              <w:rPr>
+                <w:sz w:val="28"/>
+                <w:szCs w:val="28"/>
+              </w:rPr>
+              <w:t xml:space="preserve"> </w:t>
+            </w:r>
+            <w:r>
+              <w:rPr>
+                <w:rFonts w:cs="Nirmala UI" w:eastAsia="Nirmala UI"/>
+                <w:sz w:val="28"/>
+                <w:szCs w:val="28"/>
+              </w:rPr>
+              <w:t>अध्ययन करें</w:t>
             </w:r>
           </w:p>
         </w:tc>
@@ -932,6 +1018,7 @@
             <w:pPr>
               <w:pStyle w:val="TableParagraph"/>
               <w:spacing w:before="167"/>
+              <w:jc w:val="left"/>
               <w:rPr>
                 <w:b/>
                 <w:sz w:val="28"/>
@@ -950,14 +1037,16 @@
             <w:r>
               <w:rPr>
                 <w:sz w:val="28"/>
-              </w:rPr>
-              <w:t>28-29</w:t>
-            </w:r>
-            <w:r>
-              <w:rPr>
-                <w:spacing w:val="-5"/>
-                <w:sz w:val="28"/>
-              </w:rPr>
+                <w:szCs w:val="28"/>
+              </w:rPr>
+              <w:t>28-</w:t>
+            </w:r>
+            <w:r>
+              <w:rPr>
+                <w:sz w:val="28"/>
+                <w:szCs w:val="28"/>
+              </w:rPr>
+              <w:t>29</w:t>
             </w:r>
           </w:p>
         </w:tc>
@@ -974,6 +1063,7 @@
             <w:pPr>
               <w:pStyle w:val="TableParagraph"/>
               <w:spacing w:before="166"/>
+              <w:jc w:val="left"/>
               <w:rPr>
                 <w:b/>
                 <w:sz w:val="28"/>
@@ -991,8 +1081,8 @@
             </w:pPr>
             <w:r>
               <w:rPr>
-                <w:spacing w:val="-10"/>
-                <w:sz w:val="28"/>
+                <w:sz w:val="28"/>
+                <w:szCs w:val="28"/>
               </w:rPr>
               <w:t>5</w:t>
             </w:r>
@@ -1006,6 +1096,7 @@
             <w:pPr>
               <w:pStyle w:val="TableParagraph"/>
               <w:spacing w:before="166"/>
+              <w:jc w:val="left"/>
               <w:rPr>
                 <w:b/>
                 <w:sz w:val="28"/>
@@ -1023,43 +1114,56 @@
             </w:pPr>
             <w:r>
               <w:rPr>
-                <w:sz w:val="28"/>
-              </w:rPr>
-              <w:t>अध्ययन का महत्व.</w:t>
-            </w:r>
-            <w:r>
-              <w:rPr>
-                <w:spacing w:val="2"/>
-                <w:sz w:val="28"/>
-              </w:rPr>
-            </w:r>
-            <w:r>
-              <w:rPr>
-                <w:sz w:val="28"/>
-              </w:rPr>
-            </w:r>
-            <w:r>
-              <w:rPr>
-                <w:spacing w:val="-3"/>
-                <w:sz w:val="28"/>
-              </w:rPr>
-            </w:r>
-            <w:r>
-              <w:rPr>
-                <w:sz w:val="28"/>
-              </w:rPr>
-            </w:r>
-            <w:r>
-              <w:rPr>
-                <w:spacing w:val="2"/>
-                <w:sz w:val="28"/>
-              </w:rPr>
-            </w:r>
-            <w:r>
-              <w:rPr>
-                <w:spacing w:val="-2"/>
-                <w:sz w:val="28"/>
-              </w:rPr>
+                <w:rFonts w:cs="Nirmala UI" w:eastAsia="Nirmala UI"/>
+                <w:sz w:val="28"/>
+                <w:szCs w:val="28"/>
+              </w:rPr>
+              <w:t>महत्व</w:t>
+            </w:r>
+            <w:r>
+              <w:rPr>
+                <w:sz w:val="28"/>
+                <w:szCs w:val="28"/>
+              </w:rPr>
+              <w:t xml:space="preserve"> </w:t>
+            </w:r>
+            <w:r>
+              <w:rPr>
+                <w:rFonts w:cs="Nirmala UI" w:eastAsia="Nirmala UI"/>
+                <w:sz w:val="28"/>
+                <w:szCs w:val="28"/>
+              </w:rPr>
+              <w:t>का</w:t>
+            </w:r>
+            <w:r>
+              <w:rPr>
+                <w:sz w:val="28"/>
+                <w:szCs w:val="28"/>
+              </w:rPr>
+              <w:t xml:space="preserve"> </w:t>
+            </w:r>
+            <w:r>
+              <w:rPr>
+                <w:rFonts w:cs="Nirmala UI" w:eastAsia="Nirmala UI"/>
+                <w:sz w:val="28"/>
+                <w:szCs w:val="28"/>
+              </w:rPr>
+              <w:t>द</w:t>
+            </w:r>
+            <w:r>
+              <w:rPr>
+                <w:sz w:val="28"/>
+                <w:szCs w:val="28"/>
+              </w:rPr>
+              <w:t xml:space="preserve"> </w:t>
+            </w:r>
+            <w:r>
+              <w:rPr>
+                <w:rFonts w:cs="Nirmala UI" w:eastAsia="Nirmala UI"/>
+                <w:sz w:val="28"/>
+                <w:szCs w:val="28"/>
+              </w:rPr>
+              <w:t>अध्ययन करते हैं</w:t>
             </w:r>
           </w:p>
         </w:tc>
@@ -1071,6 +1175,7 @@
             <w:pPr>
               <w:pStyle w:val="TableParagraph"/>
               <w:spacing w:before="166"/>
+              <w:jc w:val="left"/>
               <w:rPr>
                 <w:b/>
                 <w:sz w:val="28"/>
@@ -1089,14 +1194,16 @@
             <w:r>
               <w:rPr>
                 <w:sz w:val="28"/>
-              </w:rPr>
-              <w:t>30-32</w:t>
-            </w:r>
-            <w:r>
-              <w:rPr>
-                <w:spacing w:val="-5"/>
-                <w:sz w:val="28"/>
-              </w:rPr>
+                <w:szCs w:val="28"/>
+              </w:rPr>
+              <w:t>30-</w:t>
+            </w:r>
+            <w:r>
+              <w:rPr>
+                <w:sz w:val="28"/>
+                <w:szCs w:val="28"/>
+              </w:rPr>
+              <w:t>32</w:t>
             </w:r>
           </w:p>
         </w:tc>
@@ -1113,6 +1220,7 @@
             <w:pPr>
               <w:pStyle w:val="TableParagraph"/>
               <w:spacing w:before="172"/>
+              <w:jc w:val="left"/>
               <w:rPr>
                 <w:b/>
                 <w:sz w:val="28"/>
@@ -1130,8 +1238,8 @@
             </w:pPr>
             <w:r>
               <w:rPr>
-                <w:spacing w:val="-10"/>
-                <w:sz w:val="28"/>
+                <w:sz w:val="28"/>
+                <w:szCs w:val="28"/>
               </w:rPr>
               <w:t>6</w:t>
             </w:r>
@@ -1145,6 +1253,7 @@
             <w:pPr>
               <w:pStyle w:val="TableParagraph"/>
               <w:spacing w:before="172"/>
+              <w:jc w:val="left"/>
               <w:rPr>
                 <w:b/>
                 <w:sz w:val="28"/>
@@ -1162,21 +1271,26 @@
             </w:pPr>
             <w:r>
               <w:rPr>
-                <w:sz w:val="28"/>
-              </w:rPr>
-              <w:t>डेटा विश्लेषण।</w:t>
-            </w:r>
-            <w:r>
-              <w:rPr>
-                <w:spacing w:val="-16"/>
-                <w:sz w:val="28"/>
-              </w:rPr>
-            </w:r>
-            <w:r>
-              <w:rPr>
-                <w:spacing w:val="-2"/>
-                <w:sz w:val="28"/>
-              </w:rPr>
+                <w:rFonts w:cs="Nirmala UI" w:eastAsia="Nirmala UI"/>
+                <w:sz w:val="28"/>
+                <w:szCs w:val="28"/>
+              </w:rPr>
+              <w:t>आंकड़े</w:t>
+            </w:r>
+            <w:r>
+              <w:rPr>
+                <w:sz w:val="28"/>
+                <w:szCs w:val="28"/>
+              </w:rPr>
+              <w:t xml:space="preserve"> </w:t>
+            </w:r>
+            <w:r>
+              <w:rPr>
+                <w:rFonts w:cs="Nirmala UI" w:eastAsia="Nirmala UI"/>
+                <w:sz w:val="28"/>
+                <w:szCs w:val="28"/>
+              </w:rPr>
+              <w:t>विश्लेषण</w:t>
             </w:r>
           </w:p>
         </w:tc>
@@ -1188,6 +1302,7 @@
             <w:pPr>
               <w:pStyle w:val="TableParagraph"/>
               <w:spacing w:before="172"/>
+              <w:jc w:val="left"/>
               <w:rPr>
                 <w:b/>
                 <w:sz w:val="28"/>
@@ -1206,14 +1321,16 @@
             <w:r>
               <w:rPr>
                 <w:sz w:val="28"/>
-              </w:rPr>
-              <w:t>33-53</w:t>
-            </w:r>
-            <w:r>
-              <w:rPr>
-                <w:spacing w:val="-5"/>
-                <w:sz w:val="28"/>
-              </w:rPr>
+                <w:szCs w:val="28"/>
+              </w:rPr>
+              <w:t>33-</w:t>
+            </w:r>
+            <w:r>
+              <w:rPr>
+                <w:sz w:val="28"/>
+                <w:szCs w:val="28"/>
+              </w:rPr>
+              <w:t>53</w:t>
             </w:r>
           </w:p>
         </w:tc>
@@ -1230,6 +1347,7 @@
             <w:pPr>
               <w:pStyle w:val="TableParagraph"/>
               <w:spacing w:before="171"/>
+              <w:jc w:val="left"/>
               <w:rPr>
                 <w:b/>
                 <w:sz w:val="28"/>
@@ -1247,8 +1365,8 @@
             </w:pPr>
             <w:r>
               <w:rPr>
-                <w:spacing w:val="-10"/>
-                <w:sz w:val="28"/>
+                <w:sz w:val="28"/>
+                <w:szCs w:val="28"/>
               </w:rPr>
               <w:t>7</w:t>
             </w:r>
@@ -1262,6 +1380,7 @@
             <w:pPr>
               <w:pStyle w:val="TableParagraph"/>
               <w:spacing w:before="171"/>
+              <w:jc w:val="left"/>
               <w:rPr>
                 <w:b/>
                 <w:sz w:val="28"/>
@@ -1279,32 +1398,41 @@
             </w:pPr>
             <w:r>
               <w:rPr>
-                <w:sz w:val="28"/>
-              </w:rPr>
-              <w:t>परिणाम और चर्चा।</w:t>
-            </w:r>
-            <w:r>
-              <w:rPr>
-                <w:spacing w:val="1"/>
-                <w:sz w:val="28"/>
-              </w:rPr>
-            </w:r>
-            <w:r>
-              <w:rPr>
-                <w:sz w:val="28"/>
-              </w:rPr>
-            </w:r>
-            <w:r>
-              <w:rPr>
-                <w:spacing w:val="1"/>
-                <w:sz w:val="28"/>
-              </w:rPr>
-            </w:r>
-            <w:r>
-              <w:rPr>
-                <w:spacing w:val="-2"/>
-                <w:sz w:val="28"/>
-              </w:rPr>
+                <w:rFonts w:cs="Nirmala UI" w:eastAsia="Nirmala UI"/>
+                <w:sz w:val="28"/>
+                <w:szCs w:val="28"/>
+              </w:rPr>
+              <w:t>परिणाम</w:t>
+            </w:r>
+            <w:r>
+              <w:rPr>
+                <w:sz w:val="28"/>
+                <w:szCs w:val="28"/>
+              </w:rPr>
+              <w:t xml:space="preserve"> </w:t>
+            </w:r>
+            <w:r>
+              <w:rPr>
+                <w:rFonts w:cs="Nirmala UI" w:eastAsia="Nirmala UI"/>
+                <w:sz w:val="28"/>
+                <w:szCs w:val="28"/>
+              </w:rPr>
+              <w:t>और</w:t>
+            </w:r>
+            <w:r>
+              <w:rPr>
+                <w:sz w:val="28"/>
+                <w:szCs w:val="28"/>
+              </w:rPr>
+              <w:t xml:space="preserve"> </w:t>
+            </w:r>
+            <w:r>
+              <w:rPr>
+                <w:rFonts w:cs="Nirmala UI" w:eastAsia="Nirmala UI"/>
+                <w:sz w:val="28"/>
+                <w:szCs w:val="28"/>
+              </w:rPr>
+              <w:t>चर्चा</w:t>
             </w:r>
           </w:p>
         </w:tc>
@@ -1316,6 +1444,7 @@
             <w:pPr>
               <w:pStyle w:val="TableParagraph"/>
               <w:spacing w:before="171"/>
+              <w:jc w:val="left"/>
               <w:rPr>
                 <w:b/>
                 <w:sz w:val="28"/>
@@ -1334,15 +1463,16 @@
             <w:r>
               <w:rPr>
                 <w:sz w:val="28"/>
-              </w:rPr>
-              <w:br/>
-              <w:t>54-56</w:t>
-            </w:r>
-            <w:r>
-              <w:rPr>
-                <w:spacing w:val="-5"/>
-                <w:sz w:val="28"/>
-              </w:rPr>
+                <w:szCs w:val="28"/>
+              </w:rPr>
+              <w:t>54-</w:t>
+            </w:r>
+            <w:r>
+              <w:rPr>
+                <w:sz w:val="28"/>
+                <w:szCs w:val="28"/>
+              </w:rPr>
+              <w:t>56</w:t>
             </w:r>
           </w:p>
         </w:tc>
@@ -1359,6 +1489,7 @@
             <w:pPr>
               <w:pStyle w:val="TableParagraph"/>
               <w:spacing w:before="172"/>
+              <w:jc w:val="left"/>
               <w:rPr>
                 <w:b/>
                 <w:sz w:val="28"/>
@@ -1376,8 +1507,8 @@
             </w:pPr>
             <w:r>
               <w:rPr>
-                <w:spacing w:val="-10"/>
-                <w:sz w:val="28"/>
+                <w:sz w:val="28"/>
+                <w:szCs w:val="28"/>
               </w:rPr>
               <w:t>8</w:t>
             </w:r>
@@ -1391,6 +1522,7 @@
             <w:pPr>
               <w:pStyle w:val="TableParagraph"/>
               <w:spacing w:before="172"/>
+              <w:jc w:val="left"/>
               <w:rPr>
                 <w:b/>
                 <w:sz w:val="28"/>
@@ -1408,21 +1540,26 @@
             </w:pPr>
             <w:r>
               <w:rPr>
-                <w:sz w:val="28"/>
-              </w:rPr>
-              <w:t>सुझाव और सुझाव</w:t>
-            </w:r>
-            <w:r>
-              <w:rPr>
-                <w:spacing w:val="1"/>
-                <w:sz w:val="28"/>
-              </w:rPr>
-            </w:r>
-            <w:r>
-              <w:rPr>
-                <w:spacing w:val="-2"/>
-                <w:sz w:val="28"/>
-              </w:rPr>
+                <w:rFonts w:cs="Nirmala UI" w:eastAsia="Nirmala UI"/>
+                <w:sz w:val="28"/>
+                <w:szCs w:val="28"/>
+              </w:rPr>
+              <w:t>निष्कर्ष और</w:t>
+            </w:r>
+            <w:r>
+              <w:rPr>
+                <w:sz w:val="28"/>
+                <w:szCs w:val="28"/>
+              </w:rPr>
+              <w:t xml:space="preserve"> </w:t>
+            </w:r>
+            <w:r>
+              <w:rPr>
+                <w:rFonts w:cs="Nirmala UI" w:eastAsia="Nirmala UI"/>
+                <w:sz w:val="28"/>
+                <w:szCs w:val="28"/>
+              </w:rPr>
+              <w:t>सुझाव</w:t>
             </w:r>
           </w:p>
         </w:tc>
@@ -1434,6 +1571,7 @@
             <w:pPr>
               <w:pStyle w:val="TableParagraph"/>
               <w:spacing w:before="172"/>
+              <w:jc w:val="left"/>
               <w:rPr>
                 <w:b/>
                 <w:sz w:val="28"/>
@@ -1452,14 +1590,16 @@
             <w:r>
               <w:rPr>
                 <w:sz w:val="28"/>
-              </w:rPr>
-              <w:t>57-59</w:t>
-            </w:r>
-            <w:r>
-              <w:rPr>
-                <w:spacing w:val="-5"/>
-                <w:sz w:val="28"/>
-              </w:rPr>
+                <w:szCs w:val="28"/>
+              </w:rPr>
+              <w:t>57-</w:t>
+            </w:r>
+            <w:r>
+              <w:rPr>
+                <w:sz w:val="28"/>
+                <w:szCs w:val="28"/>
+              </w:rPr>
+              <w:t>59</w:t>
             </w:r>
           </w:p>
         </w:tc>
@@ -1476,6 +1616,7 @@
             <w:pPr>
               <w:pStyle w:val="TableParagraph"/>
               <w:spacing w:before="171"/>
+              <w:jc w:val="left"/>
               <w:rPr>
                 <w:b/>
                 <w:sz w:val="28"/>
@@ -1493,8 +1634,8 @@
             </w:pPr>
             <w:r>
               <w:rPr>
-                <w:spacing w:val="-10"/>
-                <w:sz w:val="28"/>
+                <w:sz w:val="28"/>
+                <w:szCs w:val="28"/>
               </w:rPr>
               <w:t>9</w:t>
             </w:r>
@@ -1508,6 +1649,7 @@
             <w:pPr>
               <w:pStyle w:val="TableParagraph"/>
               <w:spacing w:before="171"/>
+              <w:jc w:val="left"/>
               <w:rPr>
                 <w:b/>
                 <w:sz w:val="28"/>
@@ -1525,8 +1667,9 @@
             </w:pPr>
             <w:r>
               <w:rPr>
-                <w:spacing w:val="-2"/>
-                <w:sz w:val="28"/>
+                <w:rFonts w:cs="Nirmala UI" w:eastAsia="Nirmala UI"/>
+                <w:sz w:val="28"/>
+                <w:szCs w:val="28"/>
               </w:rPr>
               <w:t>संदर्भ</w:t>
             </w:r>
@@ -1540,6 +1683,7 @@
             <w:pPr>
               <w:pStyle w:val="TableParagraph"/>
               <w:spacing w:before="171"/>
+              <w:jc w:val="left"/>
               <w:rPr>
                 <w:b/>
                 <w:sz w:val="28"/>
@@ -1558,14 +1702,16 @@
             <w:r>
               <w:rPr>
                 <w:sz w:val="28"/>
-              </w:rPr>
-              <w:t>60-64।</w:t>
-            </w:r>
-            <w:r>
-              <w:rPr>
-                <w:spacing w:val="-5"/>
-                <w:sz w:val="28"/>
-              </w:rPr>
+                <w:szCs w:val="28"/>
+              </w:rPr>
+              <w:t>60-</w:t>
+            </w:r>
+            <w:r>
+              <w:rPr>
+                <w:sz w:val="28"/>
+                <w:szCs w:val="28"/>
+              </w:rPr>
+              <w:t>64</w:t>
             </w:r>
           </w:p>
         </w:tc>

</xml_diff>